<commit_message>
yeu cau fix bug content
</commit_message>
<xml_diff>
--- a/docs/requirements/20260507/bug.docx
+++ b/docs/requirements/20260507/bug.docx
@@ -395,6 +395,53 @@
       </w:r>
     </w:p>
     <w:p>
+      <w:pPr>
+        <w:pStyle w:val="NormalWeb"/>
+        <w:numPr>
+          <w:ilvl w:val="0"/>
+          <w:numId w:val="10"/>
+        </w:numPr>
+        <w:spacing w:before="240" w:beforeAutospacing="0" w:after="0" w:afterAutospacing="0"/>
+        <w:textAlignment w:val="baseline"/>
+      </w:pPr>
+      <w:r>
+        <w:rPr>
+          <w:rFonts w:ascii="Arial" w:hAnsi="Arial" w:cs="Arial"/>
+          <w:color w:val="000000"/>
+          <w:sz w:val="22"/>
+          <w:szCs w:val="22"/>
+        </w:rPr>
+        <w:t xml:space="preserve">Tại trang </w:t>
+      </w:r>
+      <w:r>
+        <w:rPr>
+          <w:rFonts w:ascii="Arial" w:hAnsi="Arial" w:cs="Arial"/>
+          <w:color w:val="000000"/>
+          <w:sz w:val="22"/>
+          <w:szCs w:val="22"/>
+        </w:rPr>
+        <w:t>Danh sách sự kiện</w:t>
+      </w:r>
+      <w:r>
+        <w:rPr>
+          <w:rFonts w:ascii="Arial" w:hAnsi="Arial" w:cs="Arial"/>
+          <w:color w:val="000000"/>
+          <w:sz w:val="22"/>
+          <w:szCs w:val="22"/>
+        </w:rPr>
+        <w:t xml:space="preserve"> có đường dẫn là </w:t>
+      </w:r>
+      <w:hyperlink r:id="rId9" w:history="1">
+        <w:r>
+          <w:rPr>
+            <w:rStyle w:val="Hyperlink"/>
+          </w:rPr>
+          <w:t>https://hub.reborn.vn/crm/events</w:t>
+        </w:r>
+      </w:hyperlink>
+      <w:r>
+        <w:t>, kiểm tra các sự kiện là sự kiện test ( check trường isTest) nếu là sự kiện test thì phải ở trạng thái đăng nhập (có tokent) và là admin thì mới hiển thị, người dùng không đăng nhập và người dùng khác sẽ không nhìn thấy các sự kiện test</w:t>
+      </w:r>
       <w:bookmarkStart w:id="0" w:name="_GoBack"/>
       <w:bookmarkEnd w:id="0"/>
     </w:p>
@@ -1493,7 +1540,6 @@
     <w:name w:val="Normal (Web)"/>
     <w:basedOn w:val="Normal"/>
     <w:uiPriority w:val="99"/>
-    <w:semiHidden/>
     <w:unhideWhenUsed/>
     <w:rsid w:val="002A6030"/>
     <w:pPr>
@@ -1509,7 +1555,6 @@
     <w:name w:val="Hyperlink"/>
     <w:basedOn w:val="DefaultParagraphFont"/>
     <w:uiPriority w:val="99"/>
-    <w:semiHidden/>
     <w:unhideWhenUsed/>
     <w:rsid w:val="002A6030"/>
     <w:rPr>
@@ -1550,6 +1595,18 @@
       <w:rFonts w:ascii="Segoe UI" w:hAnsi="Segoe UI" w:cs="Segoe UI"/>
       <w:sz w:val="18"/>
       <w:szCs w:val="18"/>
+    </w:rPr>
+  </w:style>
+  <w:style w:type="character" w:styleId="UnresolvedMention">
+    <w:name w:val="Unresolved Mention"/>
+    <w:basedOn w:val="DefaultParagraphFont"/>
+    <w:uiPriority w:val="99"/>
+    <w:semiHidden/>
+    <w:unhideWhenUsed/>
+    <w:rsid w:val="001B7219"/>
+    <w:rPr>
+      <w:color w:val="605E5C"/>
+      <w:shd w:val="clear" w:color="auto" w:fill="E1DFDD"/>
     </w:rPr>
   </w:style>
 </w:styles>

</xml_diff>